<commit_message>
Selskapsopplysninger inn i 9.1 og brevhodet
</commit_message>
<xml_diff>
--- a/NFIFProsjekt/tilbud/OVERSENDELSESBREV.docx
+++ b/NFIFProsjekt/tilbud/OVERSENDELSESBREV.docx
@@ -13,12 +13,30 @@
         <w:t xml:space="preserve"> </w:t>
       </w:r>
       <w:r>
-        <w:t xml:space="preserve">31. august 2026</w:t>
+        <w:t xml:space="preserve">Org.nr. 937 878 818</w:t>
+      </w:r>
+      <w:r>
+        <w:t xml:space="preserve"> </w:t>
+      </w:r>
+      <w:r>
+        <w:t xml:space="preserve">Idrettsveien 50, 1400 Ski</w:t>
       </w:r>
     </w:p>
     <w:p>
       <w:pPr>
-        <w:pStyle w:val="BodyText"/>
+        <w:pStyle w:val="Compact"/>
+        <w:numPr>
+          <w:ilvl w:val="0"/>
+          <w:numId w:val="1001"/>
+        </w:numPr>
+      </w:pPr>
+      <w:r>
+        <w:t xml:space="preserve">august 2026</w:t>
+      </w:r>
+    </w:p>
+    <w:p>
+      <w:pPr>
+        <w:pStyle w:val="FirstParagraph"/>
       </w:pPr>
       <w:r>
         <w:rPr>
@@ -62,19 +80,19 @@
         <w:t xml:space="preserve"> </w:t>
       </w:r>
       <w:r>
-        <w:t xml:space="preserve">agentvirksomhet og trenervirksomhet. Vi har bygget og drifter i dag</w:t>
-      </w:r>
-      <w:r>
-        <w:t xml:space="preserve"> </w:t>
-      </w:r>
-      <w:r>
-        <w:t xml:space="preserve">friidrettsresultater.no, en statistikkplattform med norske resultatdata som er</w:t>
-      </w:r>
-      <w:r>
-        <w:t xml:space="preserve"> </w:t>
-      </w:r>
-      <w:r>
-        <w:t xml:space="preserve">i drift.</w:t>
+        <w:t xml:space="preserve">agentvirksomhet og trenervirksomhet, og inngår i Fire S Invest AS. Vi har</w:t>
+      </w:r>
+      <w:r>
+        <w:t xml:space="preserve"> </w:t>
+      </w:r>
+      <w:r>
+        <w:t xml:space="preserve">bygget og drifter friidrettsresultater.no, en statistikkplattform med norske</w:t>
+      </w:r>
+      <w:r>
+        <w:t xml:space="preserve"> </w:t>
+      </w:r>
+      <w:r>
+        <w:t xml:space="preserve">resultatdata som er i drift.</w:t>
       </w:r>
     </w:p>
     <w:p>
@@ -712,8 +730,123 @@
       </w:pPr>
     </w:lvl>
   </w:abstractNum>
+  <w:abstractNum w:abstractNumId="994131">
+    <w:nsid w:val="0A994131"/>
+    <w:multiLevelType w:val="multilevel"/>
+    <w:lvl w:ilvl="0">
+      <w:start w:val="31"/>
+      <w:numFmt w:val="decimal"/>
+      <w:lvlText w:val="%1."/>
+      <w:lvlJc w:val="left"/>
+      <w:pPr>
+        <w:ind w:left="720" w:hanging="360"/>
+      </w:pPr>
+    </w:lvl>
+    <w:lvl w:ilvl="1">
+      <w:start w:val="31"/>
+      <w:numFmt w:val="decimal"/>
+      <w:lvlText w:val="%2."/>
+      <w:lvlJc w:val="left"/>
+      <w:pPr>
+        <w:ind w:left="1440" w:hanging="360"/>
+      </w:pPr>
+    </w:lvl>
+    <w:lvl w:ilvl="2">
+      <w:start w:val="31"/>
+      <w:numFmt w:val="decimal"/>
+      <w:lvlText w:val="%3."/>
+      <w:lvlJc w:val="left"/>
+      <w:pPr>
+        <w:ind w:left="2160" w:hanging="360"/>
+      </w:pPr>
+    </w:lvl>
+    <w:lvl w:ilvl="3">
+      <w:start w:val="31"/>
+      <w:numFmt w:val="decimal"/>
+      <w:lvlText w:val="%4."/>
+      <w:lvlJc w:val="left"/>
+      <w:pPr>
+        <w:ind w:left="2880" w:hanging="360"/>
+      </w:pPr>
+    </w:lvl>
+    <w:lvl w:ilvl="4">
+      <w:start w:val="31"/>
+      <w:numFmt w:val="decimal"/>
+      <w:lvlText w:val="%5."/>
+      <w:lvlJc w:val="left"/>
+      <w:pPr>
+        <w:ind w:left="3600" w:hanging="360"/>
+      </w:pPr>
+    </w:lvl>
+    <w:lvl w:ilvl="5">
+      <w:start w:val="31"/>
+      <w:numFmt w:val="decimal"/>
+      <w:lvlText w:val="%6."/>
+      <w:lvlJc w:val="left"/>
+      <w:pPr>
+        <w:ind w:left="4320" w:hanging="360"/>
+      </w:pPr>
+    </w:lvl>
+    <w:lvl w:ilvl="6">
+      <w:start w:val="31"/>
+      <w:numFmt w:val="decimal"/>
+      <w:lvlText w:val="%7."/>
+      <w:lvlJc w:val="left"/>
+      <w:pPr>
+        <w:ind w:left="5040" w:hanging="360"/>
+      </w:pPr>
+    </w:lvl>
+    <w:lvl w:ilvl="7">
+      <w:start w:val="31"/>
+      <w:numFmt w:val="decimal"/>
+      <w:lvlText w:val="%8."/>
+      <w:lvlJc w:val="left"/>
+      <w:pPr>
+        <w:ind w:left="5760" w:hanging="360"/>
+      </w:pPr>
+    </w:lvl>
+    <w:lvl w:ilvl="8">
+      <w:start w:val="31"/>
+      <w:numFmt w:val="decimal"/>
+      <w:lvlText w:val="%9."/>
+      <w:lvlJc w:val="left"/>
+      <w:pPr>
+        <w:ind w:left="6480" w:hanging="360"/>
+      </w:pPr>
+    </w:lvl>
+  </w:abstractNum>
   <w:num w:numId="1000">
     <w:abstractNumId w:val="990"/>
+  </w:num>
+  <w:num w:numId="1001">
+    <w:abstractNumId w:val="994131"/>
+    <w:lvlOverride w:ilvl="0">
+      <w:startOverride w:val="31"/>
+    </w:lvlOverride>
+    <w:lvlOverride w:ilvl="1">
+      <w:startOverride w:val="31"/>
+    </w:lvlOverride>
+    <w:lvlOverride w:ilvl="2">
+      <w:startOverride w:val="31"/>
+    </w:lvlOverride>
+    <w:lvlOverride w:ilvl="3">
+      <w:startOverride w:val="31"/>
+    </w:lvlOverride>
+    <w:lvlOverride w:ilvl="4">
+      <w:startOverride w:val="31"/>
+    </w:lvlOverride>
+    <w:lvlOverride w:ilvl="5">
+      <w:startOverride w:val="31"/>
+    </w:lvlOverride>
+    <w:lvlOverride w:ilvl="6">
+      <w:startOverride w:val="31"/>
+    </w:lvlOverride>
+    <w:lvlOverride w:ilvl="7">
+      <w:startOverride w:val="31"/>
+    </w:lvlOverride>
+    <w:lvlOverride w:ilvl="8">
+      <w:startOverride w:val="31"/>
+    </w:lvlOverride>
   </w:num>
 </w:numbering>
 </file>

</xml_diff>

<commit_message>
Ingen påstander om andre tilbud
</commit_message>
<xml_diff>
--- a/NFIFProsjekt/tilbud/OVERSENDELSESBREV.docx
+++ b/NFIFProsjekt/tilbud/OVERSENDELSESBREV.docx
@@ -104,45 +104,37 @@
           <w:b/>
           <w:bCs/>
         </w:rPr>
-        <w:t xml:space="preserve">Det vi mener skiller tilbudet fra de øvrige, er at plattformen finnes</w:t>
-      </w:r>
-      <w:r>
-        <w:rPr>
-          <w:b/>
-          <w:bCs/>
-        </w:rPr>
-        <w:t xml:space="preserve"> </w:t>
-      </w:r>
-      <w:r>
-        <w:rPr>
-          <w:b/>
-          <w:bCs/>
-        </w:rPr>
-        <w:t xml:space="preserve">allerede.</w:t>
-      </w:r>
-      <w:r>
-        <w:t xml:space="preserve"> </w:t>
-      </w:r>
-      <w:r>
-        <w:t xml:space="preserve">1 922 634 resultater er importert, normalisert og søkbare, hvorav</w:t>
-      </w:r>
-      <w:r>
-        <w:t xml:space="preserve"> </w:t>
-      </w:r>
-      <w:r>
-        <w:t xml:space="preserve">1 701 902 fra 2013 og senere. Migreringen av historiske data, som normalt er</w:t>
-      </w:r>
-      <w:r>
-        <w:t xml:space="preserve"> </w:t>
-      </w:r>
-      <w:r>
-        <w:t xml:space="preserve">den dyreste og mest risikofylte posten i en slik anskaffelse, er gjennomført.</w:t>
-      </w:r>
-      <w:r>
-        <w:t xml:space="preserve"> </w:t>
-      </w:r>
-      <w:r>
-        <w:t xml:space="preserve">Åtte av fjorten obligatoriske krav i §22 er i drift i dag.</w:t>
+        <w:t xml:space="preserve">Kjernen i tilbudet er at plattformen allerede finnes.</w:t>
+      </w:r>
+      <w:r>
+        <w:t xml:space="preserve"> </w:t>
+      </w:r>
+      <w:r>
+        <w:t xml:space="preserve">1 922 634 resultater</w:t>
+      </w:r>
+      <w:r>
+        <w:t xml:space="preserve"> </w:t>
+      </w:r>
+      <w:r>
+        <w:t xml:space="preserve">er importert, normalisert og søkbare, hvorav 1 701 902 fra 2013 og senere.</w:t>
+      </w:r>
+      <w:r>
+        <w:t xml:space="preserve"> </w:t>
+      </w:r>
+      <w:r>
+        <w:t xml:space="preserve">Migreringen av historiske data, som normalt er den dyreste og mest risikofylte</w:t>
+      </w:r>
+      <w:r>
+        <w:t xml:space="preserve"> </w:t>
+      </w:r>
+      <w:r>
+        <w:t xml:space="preserve">posten i en slik anskaffelse, er gjennomført. Åtte av fjorten obligatoriske</w:t>
+      </w:r>
+      <w:r>
+        <w:t xml:space="preserve"> </w:t>
+      </w:r>
+      <w:r>
+        <w:t xml:space="preserve">krav i §22 er i drift i dag.</w:t>
       </w:r>
     </w:p>
     <w:p>

</xml_diff>